<commit_message>
Invoice GST: editable room/food GST rates with auto defaults
- Add ROOM_GST_RATE/FOOD_GST_RATE (editable, auto-default 18% if section
  subtotal > 7,500 else 5%) and ROOM_GST_AMT/FOOD_GST_AMT/TOTAL_GST computed.
- GST fields show only for the GST template (template.gst flag); Grand Total
  and Balance include GST when applicable, exclude it otherwise.
- GST invoice .docx now prints the GST breakdown (rate% + amounts + total GST);
  non-GST template unchanged.

Co-Authored-By: Claude Opus 4.8 <noreply@anthropic.com>
Claude-Session: https://claude.ai/code/session_01EJoc82iQwt2CP6Tyx6TiML
</commit_message>
<xml_diff>
--- a/letterheads/05_Guest_Invoice_GST.docx
+++ b/letterheads/05_Guest_Invoice_GST.docx
@@ -629,6 +629,132 @@
                 <w:color w:val="333333"/>
                 <w:sz w:val="20"/>
               </w:rPr>
+              <w:t xml:space="preserve">Room GST ({ROOM_GST_RATE}%): </w:t>
+            </w:r>
+          </w:p>
+        </w:tc>
+        <w:tc>
+          <w:tcPr>
+            <w:tcW w:type="dxa" w:w="5100"/>
+          </w:tcPr>
+          <w:p>
+            <w:pPr>
+              <w:jc w:val="right"/>
+            </w:pPr>
+            <w:r>
+              <w:rPr>
+                <w:rFonts w:ascii="Calibri" w:hAnsi="Calibri"/>
+                <w:b/>
+                <w:i w:val="0"/>
+                <w:color w:val="333333"/>
+                <w:sz w:val="20"/>
+              </w:rPr>
+              <w:t>Rs. {ROOM_GST_AMT}</w:t>
+            </w:r>
+          </w:p>
+        </w:tc>
+      </w:tr>
+      <w:tr>
+        <w:tc>
+          <w:tcPr>
+            <w:tcW w:type="dxa" w:w="5100"/>
+          </w:tcPr>
+          <w:p>
+            <w:pPr>
+              <w:jc w:val="right"/>
+            </w:pPr>
+            <w:r>
+              <w:rPr>
+                <w:rFonts w:ascii="Calibri" w:hAnsi="Calibri"/>
+                <w:b/>
+                <w:i w:val="0"/>
+                <w:color w:val="333333"/>
+                <w:sz w:val="20"/>
+              </w:rPr>
+              <w:t xml:space="preserve">Food GST ({FOOD_GST_RATE}%): </w:t>
+            </w:r>
+          </w:p>
+        </w:tc>
+        <w:tc>
+          <w:tcPr>
+            <w:tcW w:type="dxa" w:w="5100"/>
+          </w:tcPr>
+          <w:p>
+            <w:pPr>
+              <w:jc w:val="right"/>
+            </w:pPr>
+            <w:r>
+              <w:rPr>
+                <w:rFonts w:ascii="Calibri" w:hAnsi="Calibri"/>
+                <w:b/>
+                <w:i w:val="0"/>
+                <w:color w:val="333333"/>
+                <w:sz w:val="20"/>
+              </w:rPr>
+              <w:t>Rs. {FOOD_GST_AMT}</w:t>
+            </w:r>
+          </w:p>
+        </w:tc>
+      </w:tr>
+      <w:tr>
+        <w:tc>
+          <w:tcPr>
+            <w:tcW w:type="dxa" w:w="5100"/>
+          </w:tcPr>
+          <w:p>
+            <w:pPr>
+              <w:jc w:val="right"/>
+            </w:pPr>
+            <w:r>
+              <w:rPr>
+                <w:rFonts w:ascii="Calibri" w:hAnsi="Calibri"/>
+                <w:b/>
+                <w:i w:val="0"/>
+                <w:color w:val="333333"/>
+                <w:sz w:val="20"/>
+              </w:rPr>
+              <w:t xml:space="preserve">Total GST: </w:t>
+            </w:r>
+          </w:p>
+        </w:tc>
+        <w:tc>
+          <w:tcPr>
+            <w:tcW w:type="dxa" w:w="5100"/>
+          </w:tcPr>
+          <w:p>
+            <w:pPr>
+              <w:jc w:val="right"/>
+            </w:pPr>
+            <w:r>
+              <w:rPr>
+                <w:rFonts w:ascii="Calibri" w:hAnsi="Calibri"/>
+                <w:b/>
+                <w:i w:val="0"/>
+                <w:color w:val="333333"/>
+                <w:sz w:val="20"/>
+              </w:rPr>
+              <w:t>Rs. {TOTAL_GST}</w:t>
+            </w:r>
+          </w:p>
+        </w:tc>
+      </w:tr>
+      <w:tr>
+        <w:tc>
+          <w:tcPr>
+            <w:tcW w:type="dxa" w:w="5100"/>
+          </w:tcPr>
+          <w:p>
+            <w:pPr>
+              <w:jc w:val="right"/>
+            </w:pPr>
+            <w:r>
+              <w:rPr>
+                <w:rFonts w:ascii="Calibri" w:hAnsi="Calibri"/>
+                <w:b/>
+                <w:i w:val="0"/>
+                <w:color w:val="333333"/>
+                <w:sz w:val="20"/>
+              </w:rPr>
               <w:t xml:space="preserve">Grand Total: </w:t>
             </w:r>
           </w:p>

</xml_diff>